<commit_message>
Debugging the results an manually adding missing data
</commit_message>
<xml_diff>
--- a/StrategicTillage_GC_Analysis_workFlow.docx
+++ b/StrategicTillage_GC_Analysis_workFlow.docx
@@ -620,6 +620,8 @@
         <w:t>Checking standards manually</w:t>
       </w:r>
     </w:p>
+    <w:p/>
+    <w:p/>
     <w:p>
       <w:pPr>
         <w:rPr>
@@ -691,7 +693,7 @@
                     </pic:cNvPicPr>
                   </pic:nvPicPr>
                   <pic:blipFill>
-                    <a:blip r:embed="rId6" cstate="print">
+                    <a:blip r:embed="rId8" cstate="print">
                       <a:extLst>
                         <a:ext uri="{28A0092B-C50C-407E-A947-70E740481C1C}">
                           <a14:useLocalDpi xmlns:a14="http://schemas.microsoft.com/office/drawing/2010/main" val="0"/>
@@ -759,7 +761,7 @@
                     </pic:cNvPicPr>
                   </pic:nvPicPr>
                   <pic:blipFill>
-                    <a:blip r:embed="rId7" cstate="print">
+                    <a:blip r:embed="rId9" cstate="print">
                       <a:extLst>
                         <a:ext uri="{28A0092B-C50C-407E-A947-70E740481C1C}">
                           <a14:useLocalDpi xmlns:a14="http://schemas.microsoft.com/office/drawing/2010/main" val="0"/>
@@ -807,6 +809,7 @@
     </w:p>
     <w:p>
       <w:r>
+        <w:lastRenderedPageBreak/>
         <w:br w:type="page"/>
       </w:r>
     </w:p>
@@ -886,7 +889,7 @@
                     </pic:cNvPicPr>
                   </pic:nvPicPr>
                   <pic:blipFill>
-                    <a:blip r:embed="rId8" cstate="print">
+                    <a:blip r:embed="rId10" cstate="print">
                       <a:extLst>
                         <a:ext uri="{28A0092B-C50C-407E-A947-70E740481C1C}">
                           <a14:useLocalDpi xmlns:a14="http://schemas.microsoft.com/office/drawing/2010/main" val="0"/>
@@ -938,7 +941,7 @@
                     </pic:cNvPicPr>
                   </pic:nvPicPr>
                   <pic:blipFill>
-                    <a:blip r:embed="rId9" cstate="print">
+                    <a:blip r:embed="rId11" cstate="print">
                       <a:extLst>
                         <a:ext uri="{28A0092B-C50C-407E-A947-70E740481C1C}">
                           <a14:useLocalDpi xmlns:a14="http://schemas.microsoft.com/office/drawing/2010/main" val="0"/>
@@ -1062,7 +1065,7 @@
                     </pic:cNvPicPr>
                   </pic:nvPicPr>
                   <pic:blipFill>
-                    <a:blip r:embed="rId10" cstate="print">
+                    <a:blip r:embed="rId12" cstate="print">
                       <a:extLst>
                         <a:ext uri="{28A0092B-C50C-407E-A947-70E740481C1C}">
                           <a14:useLocalDpi xmlns:a14="http://schemas.microsoft.com/office/drawing/2010/main" val="0"/>
@@ -1114,7 +1117,7 @@
                     </pic:cNvPicPr>
                   </pic:nvPicPr>
                   <pic:blipFill>
-                    <a:blip r:embed="rId11" cstate="print">
+                    <a:blip r:embed="rId13" cstate="print">
                       <a:extLst>
                         <a:ext uri="{28A0092B-C50C-407E-A947-70E740481C1C}">
                           <a14:useLocalDpi xmlns:a14="http://schemas.microsoft.com/office/drawing/2010/main" val="0"/>
@@ -1235,7 +1238,7 @@
                     </pic:cNvPicPr>
                   </pic:nvPicPr>
                   <pic:blipFill>
-                    <a:blip r:embed="rId12" cstate="print">
+                    <a:blip r:embed="rId14" cstate="print">
                       <a:extLst>
                         <a:ext uri="{28A0092B-C50C-407E-A947-70E740481C1C}">
                           <a14:useLocalDpi xmlns:a14="http://schemas.microsoft.com/office/drawing/2010/main" val="0"/>
@@ -1303,7 +1306,7 @@
                     </pic:cNvPicPr>
                   </pic:nvPicPr>
                   <pic:blipFill>
-                    <a:blip r:embed="rId13" cstate="print">
+                    <a:blip r:embed="rId15" cstate="print">
                       <a:extLst>
                         <a:ext uri="{28A0092B-C50C-407E-A947-70E740481C1C}">
                           <a14:useLocalDpi xmlns:a14="http://schemas.microsoft.com/office/drawing/2010/main" val="0"/>
@@ -1416,7 +1419,7 @@
                     </pic:cNvPicPr>
                   </pic:nvPicPr>
                   <pic:blipFill>
-                    <a:blip r:embed="rId14" cstate="print">
+                    <a:blip r:embed="rId16" cstate="print">
                       <a:extLst>
                         <a:ext uri="{28A0092B-C50C-407E-A947-70E740481C1C}">
                           <a14:useLocalDpi xmlns:a14="http://schemas.microsoft.com/office/drawing/2010/main" val="0"/>
@@ -1468,7 +1471,7 @@
                     </pic:cNvPicPr>
                   </pic:nvPicPr>
                   <pic:blipFill>
-                    <a:blip r:embed="rId15" cstate="print">
+                    <a:blip r:embed="rId17" cstate="print">
                       <a:extLst>
                         <a:ext uri="{28A0092B-C50C-407E-A947-70E740481C1C}">
                           <a14:useLocalDpi xmlns:a14="http://schemas.microsoft.com/office/drawing/2010/main" val="0"/>
@@ -1597,7 +1600,7 @@
                     </pic:cNvPicPr>
                   </pic:nvPicPr>
                   <pic:blipFill>
-                    <a:blip r:embed="rId16" cstate="print">
+                    <a:blip r:embed="rId18" cstate="print">
                       <a:extLst>
                         <a:ext uri="{28A0092B-C50C-407E-A947-70E740481C1C}">
                           <a14:useLocalDpi xmlns:a14="http://schemas.microsoft.com/office/drawing/2010/main" val="0"/>
@@ -1649,7 +1652,7 @@
                     </pic:cNvPicPr>
                   </pic:nvPicPr>
                   <pic:blipFill>
-                    <a:blip r:embed="rId17" cstate="print">
+                    <a:blip r:embed="rId19" cstate="print">
                       <a:extLst>
                         <a:ext uri="{28A0092B-C50C-407E-A947-70E740481C1C}">
                           <a14:useLocalDpi xmlns:a14="http://schemas.microsoft.com/office/drawing/2010/main" val="0"/>
@@ -1770,7 +1773,7 @@
                     </pic:cNvPicPr>
                   </pic:nvPicPr>
                   <pic:blipFill>
-                    <a:blip r:embed="rId18" cstate="print">
+                    <a:blip r:embed="rId20" cstate="print">
                       <a:extLst>
                         <a:ext uri="{28A0092B-C50C-407E-A947-70E740481C1C}">
                           <a14:useLocalDpi xmlns:a14="http://schemas.microsoft.com/office/drawing/2010/main" val="0"/>
@@ -1830,7 +1833,7 @@
                     </pic:cNvPicPr>
                   </pic:nvPicPr>
                   <pic:blipFill>
-                    <a:blip r:embed="rId19" cstate="print">
+                    <a:blip r:embed="rId21" cstate="print">
                       <a:extLst>
                         <a:ext uri="{28A0092B-C50C-407E-A947-70E740481C1C}">
                           <a14:useLocalDpi xmlns:a14="http://schemas.microsoft.com/office/drawing/2010/main" val="0"/>
@@ -1911,7 +1914,7 @@
                     </pic:cNvPicPr>
                   </pic:nvPicPr>
                   <pic:blipFill>
-                    <a:blip r:embed="rId20" cstate="print">
+                    <a:blip r:embed="rId22" cstate="print">
                       <a:extLst>
                         <a:ext uri="{28A0092B-C50C-407E-A947-70E740481C1C}">
                           <a14:useLocalDpi xmlns:a14="http://schemas.microsoft.com/office/drawing/2010/main" val="0"/>
@@ -1963,7 +1966,7 @@
                     </pic:cNvPicPr>
                   </pic:nvPicPr>
                   <pic:blipFill>
-                    <a:blip r:embed="rId21" cstate="print">
+                    <a:blip r:embed="rId23" cstate="print">
                       <a:extLst>
                         <a:ext uri="{28A0092B-C50C-407E-A947-70E740481C1C}">
                           <a14:useLocalDpi xmlns:a14="http://schemas.microsoft.com/office/drawing/2010/main" val="0"/>
@@ -2029,151 +2032,6 @@
             <wp:extent cx="5911664" cy="3105241"/>
             <wp:effectExtent l="0" t="0" r="0" b="0"/>
             <wp:docPr id="2106566007" name="Picture 1"/>
-            <wp:cNvGraphicFramePr>
-              <a:graphicFrameLocks xmlns:a="http://schemas.openxmlformats.org/drawingml/2006/main" noChangeAspect="1"/>
-            </wp:cNvGraphicFramePr>
-            <a:graphic xmlns:a="http://schemas.openxmlformats.org/drawingml/2006/main">
-              <a:graphicData uri="http://schemas.openxmlformats.org/drawingml/2006/picture">
-                <pic:pic xmlns:pic="http://schemas.openxmlformats.org/drawingml/2006/picture">
-                  <pic:nvPicPr>
-                    <pic:cNvPr id="0" name="Picture 2"/>
-                    <pic:cNvPicPr>
-                      <a:picLocks noChangeAspect="1" noChangeArrowheads="1"/>
-                    </pic:cNvPicPr>
-                  </pic:nvPicPr>
-                  <pic:blipFill>
-                    <a:blip r:embed="rId22" cstate="print">
-                      <a:extLst>
-                        <a:ext uri="{28A0092B-C50C-407E-A947-70E740481C1C}">
-                          <a14:useLocalDpi xmlns:a14="http://schemas.microsoft.com/office/drawing/2010/main" val="0"/>
-                        </a:ext>
-                      </a:extLst>
-                    </a:blip>
-                    <a:srcRect/>
-                    <a:stretch>
-                      <a:fillRect/>
-                    </a:stretch>
-                  </pic:blipFill>
-                  <pic:spPr bwMode="auto">
-                    <a:xfrm>
-                      <a:off x="0" y="0"/>
-                      <a:ext cx="5950333" cy="3125553"/>
-                    </a:xfrm>
-                    <a:prstGeom prst="rect">
-                      <a:avLst/>
-                    </a:prstGeom>
-                    <a:noFill/>
-                  </pic:spPr>
-                </pic:pic>
-              </a:graphicData>
-            </a:graphic>
-          </wp:inline>
-        </w:drawing>
-      </w:r>
-    </w:p>
-    <w:p>
-      <w:r>
-        <w:rPr>
-          <w:noProof/>
-        </w:rPr>
-        <w:drawing>
-          <wp:inline distT="0" distB="0" distL="0" distR="0" wp14:anchorId="272075AA" wp14:editId="02BD5966">
-            <wp:extent cx="5930488" cy="3115129"/>
-            <wp:effectExtent l="0" t="0" r="0" b="9525"/>
-            <wp:docPr id="6657915" name="Picture 2"/>
-            <wp:cNvGraphicFramePr>
-              <a:graphicFrameLocks xmlns:a="http://schemas.openxmlformats.org/drawingml/2006/main" noChangeAspect="1"/>
-            </wp:cNvGraphicFramePr>
-            <a:graphic xmlns:a="http://schemas.openxmlformats.org/drawingml/2006/main">
-              <a:graphicData uri="http://schemas.openxmlformats.org/drawingml/2006/picture">
-                <pic:pic xmlns:pic="http://schemas.openxmlformats.org/drawingml/2006/picture">
-                  <pic:nvPicPr>
-                    <pic:cNvPr id="0" name="Picture 3"/>
-                    <pic:cNvPicPr>
-                      <a:picLocks noChangeAspect="1" noChangeArrowheads="1"/>
-                    </pic:cNvPicPr>
-                  </pic:nvPicPr>
-                  <pic:blipFill>
-                    <a:blip r:embed="rId23" cstate="print">
-                      <a:extLst>
-                        <a:ext uri="{28A0092B-C50C-407E-A947-70E740481C1C}">
-                          <a14:useLocalDpi xmlns:a14="http://schemas.microsoft.com/office/drawing/2010/main" val="0"/>
-                        </a:ext>
-                      </a:extLst>
-                    </a:blip>
-                    <a:srcRect/>
-                    <a:stretch>
-                      <a:fillRect/>
-                    </a:stretch>
-                  </pic:blipFill>
-                  <pic:spPr bwMode="auto">
-                    <a:xfrm>
-                      <a:off x="0" y="0"/>
-                      <a:ext cx="5965340" cy="3133436"/>
-                    </a:xfrm>
-                    <a:prstGeom prst="rect">
-                      <a:avLst/>
-                    </a:prstGeom>
-                    <a:noFill/>
-                  </pic:spPr>
-                </pic:pic>
-              </a:graphicData>
-            </a:graphic>
-          </wp:inline>
-        </w:drawing>
-      </w:r>
-    </w:p>
-    <w:p>
-      <w:r>
-        <w:t xml:space="preserve">Records 1510, </w:t>
-      </w:r>
-      <w:r>
-        <w:t xml:space="preserve">1521, </w:t>
-      </w:r>
-      <w:proofErr w:type="gramStart"/>
-      <w:r>
-        <w:t>1596 ,</w:t>
-      </w:r>
-      <w:proofErr w:type="gramEnd"/>
-      <w:r>
-        <w:t xml:space="preserve"> 1607 </w:t>
-      </w:r>
-      <w:r>
-        <w:t xml:space="preserve">and 1435 are strange. They are </w:t>
-      </w:r>
-      <w:proofErr w:type="gramStart"/>
-      <w:r>
-        <w:t>from</w:t>
-      </w:r>
-      <w:proofErr w:type="gramEnd"/>
-      <w:r>
-        <w:t xml:space="preserve"> a new standard. And are strangely consistent</w:t>
-      </w:r>
-      <w:r>
-        <w:t>.</w:t>
-      </w:r>
-    </w:p>
-    <w:p>
-      <w:r>
-        <w:br w:type="page"/>
-      </w:r>
-    </w:p>
-    <w:p>
-      <w:r>
-        <w:lastRenderedPageBreak/>
-        <w:t>2021-07-20</w:t>
-      </w:r>
-    </w:p>
-    <w:p>
-      <w:r>
-        <w:rPr>
-          <w:noProof/>
-        </w:rPr>
-        <w:drawing>
-          <wp:inline distT="0" distB="0" distL="0" distR="0" wp14:anchorId="1F6D13A2" wp14:editId="51BFA235">
-            <wp:extent cx="5885153" cy="3091315"/>
-            <wp:effectExtent l="0" t="0" r="1905" b="0"/>
-            <wp:docPr id="557926163" name="Picture 1"/>
             <wp:cNvGraphicFramePr>
               <a:graphicFrameLocks xmlns:a="http://schemas.openxmlformats.org/drawingml/2006/main" noChangeAspect="1"/>
             </wp:cNvGraphicFramePr>
@@ -2202,7 +2060,7 @@
                   <pic:spPr bwMode="auto">
                     <a:xfrm>
                       <a:off x="0" y="0"/>
-                      <a:ext cx="5910580" cy="3104671"/>
+                      <a:ext cx="5950333" cy="3125553"/>
                     </a:xfrm>
                     <a:prstGeom prst="rect">
                       <a:avLst/>
@@ -2222,10 +2080,10 @@
           <w:noProof/>
         </w:rPr>
         <w:drawing>
-          <wp:inline distT="0" distB="0" distL="0" distR="0" wp14:anchorId="6EC5F94C" wp14:editId="7F8ACD62">
-            <wp:extent cx="5923632" cy="3111527"/>
-            <wp:effectExtent l="0" t="0" r="1270" b="0"/>
-            <wp:docPr id="69257954" name="Picture 2"/>
+          <wp:inline distT="0" distB="0" distL="0" distR="0" wp14:anchorId="272075AA" wp14:editId="02BD5966">
+            <wp:extent cx="5930488" cy="3115129"/>
+            <wp:effectExtent l="0" t="0" r="0" b="9525"/>
+            <wp:docPr id="6657915" name="Picture 2"/>
             <wp:cNvGraphicFramePr>
               <a:graphicFrameLocks xmlns:a="http://schemas.openxmlformats.org/drawingml/2006/main" noChangeAspect="1"/>
             </wp:cNvGraphicFramePr>
@@ -2254,6 +2112,151 @@
                   <pic:spPr bwMode="auto">
                     <a:xfrm>
                       <a:off x="0" y="0"/>
+                      <a:ext cx="5965340" cy="3133436"/>
+                    </a:xfrm>
+                    <a:prstGeom prst="rect">
+                      <a:avLst/>
+                    </a:prstGeom>
+                    <a:noFill/>
+                  </pic:spPr>
+                </pic:pic>
+              </a:graphicData>
+            </a:graphic>
+          </wp:inline>
+        </w:drawing>
+      </w:r>
+    </w:p>
+    <w:p>
+      <w:r>
+        <w:t xml:space="preserve">Records 1510, </w:t>
+      </w:r>
+      <w:r>
+        <w:t xml:space="preserve">1521, </w:t>
+      </w:r>
+      <w:proofErr w:type="gramStart"/>
+      <w:r>
+        <w:t>1596 ,</w:t>
+      </w:r>
+      <w:proofErr w:type="gramEnd"/>
+      <w:r>
+        <w:t xml:space="preserve"> 1607 </w:t>
+      </w:r>
+      <w:r>
+        <w:t xml:space="preserve">and 1435 are strange. They are </w:t>
+      </w:r>
+      <w:proofErr w:type="gramStart"/>
+      <w:r>
+        <w:t>from</w:t>
+      </w:r>
+      <w:proofErr w:type="gramEnd"/>
+      <w:r>
+        <w:t xml:space="preserve"> a new standard. And are strangely consistent</w:t>
+      </w:r>
+      <w:r>
+        <w:t>.</w:t>
+      </w:r>
+    </w:p>
+    <w:p>
+      <w:r>
+        <w:br w:type="page"/>
+      </w:r>
+    </w:p>
+    <w:p>
+      <w:r>
+        <w:lastRenderedPageBreak/>
+        <w:t>2021-07-20</w:t>
+      </w:r>
+    </w:p>
+    <w:p>
+      <w:r>
+        <w:rPr>
+          <w:noProof/>
+        </w:rPr>
+        <w:drawing>
+          <wp:inline distT="0" distB="0" distL="0" distR="0" wp14:anchorId="1F6D13A2" wp14:editId="51BFA235">
+            <wp:extent cx="5885153" cy="3091315"/>
+            <wp:effectExtent l="0" t="0" r="1905" b="0"/>
+            <wp:docPr id="557926163" name="Picture 1"/>
+            <wp:cNvGraphicFramePr>
+              <a:graphicFrameLocks xmlns:a="http://schemas.openxmlformats.org/drawingml/2006/main" noChangeAspect="1"/>
+            </wp:cNvGraphicFramePr>
+            <a:graphic xmlns:a="http://schemas.openxmlformats.org/drawingml/2006/main">
+              <a:graphicData uri="http://schemas.openxmlformats.org/drawingml/2006/picture">
+                <pic:pic xmlns:pic="http://schemas.openxmlformats.org/drawingml/2006/picture">
+                  <pic:nvPicPr>
+                    <pic:cNvPr id="0" name="Picture 2"/>
+                    <pic:cNvPicPr>
+                      <a:picLocks noChangeAspect="1" noChangeArrowheads="1"/>
+                    </pic:cNvPicPr>
+                  </pic:nvPicPr>
+                  <pic:blipFill>
+                    <a:blip r:embed="rId26" cstate="print">
+                      <a:extLst>
+                        <a:ext uri="{28A0092B-C50C-407E-A947-70E740481C1C}">
+                          <a14:useLocalDpi xmlns:a14="http://schemas.microsoft.com/office/drawing/2010/main" val="0"/>
+                        </a:ext>
+                      </a:extLst>
+                    </a:blip>
+                    <a:srcRect/>
+                    <a:stretch>
+                      <a:fillRect/>
+                    </a:stretch>
+                  </pic:blipFill>
+                  <pic:spPr bwMode="auto">
+                    <a:xfrm>
+                      <a:off x="0" y="0"/>
+                      <a:ext cx="5910580" cy="3104671"/>
+                    </a:xfrm>
+                    <a:prstGeom prst="rect">
+                      <a:avLst/>
+                    </a:prstGeom>
+                    <a:noFill/>
+                  </pic:spPr>
+                </pic:pic>
+              </a:graphicData>
+            </a:graphic>
+          </wp:inline>
+        </w:drawing>
+      </w:r>
+    </w:p>
+    <w:p>
+      <w:r>
+        <w:rPr>
+          <w:noProof/>
+        </w:rPr>
+        <w:drawing>
+          <wp:inline distT="0" distB="0" distL="0" distR="0" wp14:anchorId="6EC5F94C" wp14:editId="7F8ACD62">
+            <wp:extent cx="5923632" cy="3111527"/>
+            <wp:effectExtent l="0" t="0" r="1270" b="0"/>
+            <wp:docPr id="69257954" name="Picture 2"/>
+            <wp:cNvGraphicFramePr>
+              <a:graphicFrameLocks xmlns:a="http://schemas.openxmlformats.org/drawingml/2006/main" noChangeAspect="1"/>
+            </wp:cNvGraphicFramePr>
+            <a:graphic xmlns:a="http://schemas.openxmlformats.org/drawingml/2006/main">
+              <a:graphicData uri="http://schemas.openxmlformats.org/drawingml/2006/picture">
+                <pic:pic xmlns:pic="http://schemas.openxmlformats.org/drawingml/2006/picture">
+                  <pic:nvPicPr>
+                    <pic:cNvPr id="0" name="Picture 3"/>
+                    <pic:cNvPicPr>
+                      <a:picLocks noChangeAspect="1" noChangeArrowheads="1"/>
+                    </pic:cNvPicPr>
+                  </pic:nvPicPr>
+                  <pic:blipFill>
+                    <a:blip r:embed="rId27" cstate="print">
+                      <a:extLst>
+                        <a:ext uri="{28A0092B-C50C-407E-A947-70E740481C1C}">
+                          <a14:useLocalDpi xmlns:a14="http://schemas.microsoft.com/office/drawing/2010/main" val="0"/>
+                        </a:ext>
+                      </a:extLst>
+                    </a:blip>
+                    <a:srcRect/>
+                    <a:stretch>
+                      <a:fillRect/>
+                    </a:stretch>
+                  </pic:blipFill>
+                  <pic:spPr bwMode="auto">
+                    <a:xfrm>
+                      <a:off x="0" y="0"/>
                       <a:ext cx="5951308" cy="3126064"/>
                     </a:xfrm>
                     <a:prstGeom prst="rect">
@@ -2318,7 +2321,7 @@
                     </pic:cNvPicPr>
                   </pic:nvPicPr>
                   <pic:blipFill>
-                    <a:blip r:embed="rId26" cstate="print">
+                    <a:blip r:embed="rId28" cstate="print">
                       <a:extLst>
                         <a:ext uri="{28A0092B-C50C-407E-A947-70E740481C1C}">
                           <a14:useLocalDpi xmlns:a14="http://schemas.microsoft.com/office/drawing/2010/main" val="0"/>
@@ -2370,7 +2373,7 @@
                     </pic:cNvPicPr>
                   </pic:nvPicPr>
                   <pic:blipFill>
-                    <a:blip r:embed="rId27" cstate="print">
+                    <a:blip r:embed="rId29" cstate="print">
                       <a:extLst>
                         <a:ext uri="{28A0092B-C50C-407E-A947-70E740481C1C}">
                           <a14:useLocalDpi xmlns:a14="http://schemas.microsoft.com/office/drawing/2010/main" val="0"/>
@@ -2411,7 +2414,6 @@
     </w:p>
     <w:p>
       <w:r>
-        <w:lastRenderedPageBreak/>
         <w:t>2021-08-05</w:t>
       </w:r>
     </w:p>
@@ -2438,7 +2440,7 @@
                     </pic:cNvPicPr>
                   </pic:nvPicPr>
                   <pic:blipFill>
-                    <a:blip r:embed="rId28" cstate="print">
+                    <a:blip r:embed="rId30" cstate="print">
                       <a:extLst>
                         <a:ext uri="{28A0092B-C50C-407E-A947-70E740481C1C}">
                           <a14:useLocalDpi xmlns:a14="http://schemas.microsoft.com/office/drawing/2010/main" val="0"/>
@@ -2490,7 +2492,7 @@
                     </pic:cNvPicPr>
                   </pic:nvPicPr>
                   <pic:blipFill>
-                    <a:blip r:embed="rId29" cstate="print">
+                    <a:blip r:embed="rId31" cstate="print">
                       <a:extLst>
                         <a:ext uri="{28A0092B-C50C-407E-A947-70E740481C1C}">
                           <a14:useLocalDpi xmlns:a14="http://schemas.microsoft.com/office/drawing/2010/main" val="0"/>
@@ -2558,7 +2560,7 @@
                     </pic:cNvPicPr>
                   </pic:nvPicPr>
                   <pic:blipFill>
-                    <a:blip r:embed="rId30" cstate="print">
+                    <a:blip r:embed="rId32" cstate="print">
                       <a:extLst>
                         <a:ext uri="{28A0092B-C50C-407E-A947-70E740481C1C}">
                           <a14:useLocalDpi xmlns:a14="http://schemas.microsoft.com/office/drawing/2010/main" val="0"/>
@@ -2610,7 +2612,7 @@
                     </pic:cNvPicPr>
                   </pic:nvPicPr>
                   <pic:blipFill>
-                    <a:blip r:embed="rId31" cstate="print">
+                    <a:blip r:embed="rId33" cstate="print">
                       <a:extLst>
                         <a:ext uri="{28A0092B-C50C-407E-A947-70E740481C1C}">
                           <a14:useLocalDpi xmlns:a14="http://schemas.microsoft.com/office/drawing/2010/main" val="0"/>
@@ -2678,7 +2680,7 @@
                     </pic:cNvPicPr>
                   </pic:nvPicPr>
                   <pic:blipFill>
-                    <a:blip r:embed="rId32" cstate="print">
+                    <a:blip r:embed="rId34" cstate="print">
                       <a:extLst>
                         <a:ext uri="{28A0092B-C50C-407E-A947-70E740481C1C}">
                           <a14:useLocalDpi xmlns:a14="http://schemas.microsoft.com/office/drawing/2010/main" val="0"/>
@@ -2730,7 +2732,7 @@
                     </pic:cNvPicPr>
                   </pic:nvPicPr>
                   <pic:blipFill>
-                    <a:blip r:embed="rId33" cstate="print">
+                    <a:blip r:embed="rId35" cstate="print">
                       <a:extLst>
                         <a:ext uri="{28A0092B-C50C-407E-A947-70E740481C1C}">
                           <a14:useLocalDpi xmlns:a14="http://schemas.microsoft.com/office/drawing/2010/main" val="0"/>
@@ -2803,7 +2805,7 @@
                     </pic:cNvPicPr>
                   </pic:nvPicPr>
                   <pic:blipFill>
-                    <a:blip r:embed="rId34" cstate="print">
+                    <a:blip r:embed="rId36" cstate="print">
                       <a:extLst>
                         <a:ext uri="{28A0092B-C50C-407E-A947-70E740481C1C}">
                           <a14:useLocalDpi xmlns:a14="http://schemas.microsoft.com/office/drawing/2010/main" val="0"/>
@@ -2855,7 +2857,7 @@
                     </pic:cNvPicPr>
                   </pic:nvPicPr>
                   <pic:blipFill>
-                    <a:blip r:embed="rId35" cstate="print">
+                    <a:blip r:embed="rId37" cstate="print">
                       <a:extLst>
                         <a:ext uri="{28A0092B-C50C-407E-A947-70E740481C1C}">
                           <a14:useLocalDpi xmlns:a14="http://schemas.microsoft.com/office/drawing/2010/main" val="0"/>
@@ -2923,7 +2925,7 @@
                     </pic:cNvPicPr>
                   </pic:nvPicPr>
                   <pic:blipFill>
-                    <a:blip r:embed="rId36" cstate="print">
+                    <a:blip r:embed="rId38" cstate="print">
                       <a:extLst>
                         <a:ext uri="{28A0092B-C50C-407E-A947-70E740481C1C}">
                           <a14:useLocalDpi xmlns:a14="http://schemas.microsoft.com/office/drawing/2010/main" val="0"/>
@@ -2975,7 +2977,7 @@
                     </pic:cNvPicPr>
                   </pic:nvPicPr>
                   <pic:blipFill>
-                    <a:blip r:embed="rId37" cstate="print">
+                    <a:blip r:embed="rId39" cstate="print">
                       <a:extLst>
                         <a:ext uri="{28A0092B-C50C-407E-A947-70E740481C1C}">
                           <a14:useLocalDpi xmlns:a14="http://schemas.microsoft.com/office/drawing/2010/main" val="0"/>
@@ -3069,7 +3071,7 @@
                     </pic:cNvPicPr>
                   </pic:nvPicPr>
                   <pic:blipFill>
-                    <a:blip r:embed="rId38" cstate="print">
+                    <a:blip r:embed="rId40" cstate="print">
                       <a:extLst>
                         <a:ext uri="{28A0092B-C50C-407E-A947-70E740481C1C}">
                           <a14:useLocalDpi xmlns:a14="http://schemas.microsoft.com/office/drawing/2010/main" val="0"/>
@@ -3104,7 +3106,7 @@
           <w:noProof/>
         </w:rPr>
         <w:drawing>
-          <wp:inline distT="0" distB="0" distL="0" distR="0" wp14:anchorId="08A3E548" wp14:editId="01358211">
+          <wp:inline distT="0" distB="0" distL="0" distR="0" wp14:anchorId="08A3E548" wp14:editId="05B455D2">
             <wp:extent cx="5927636" cy="3113631"/>
             <wp:effectExtent l="0" t="0" r="0" b="0"/>
             <wp:docPr id="222819260" name="Picture 16"/>
@@ -3121,7 +3123,7 @@
                     </pic:cNvPicPr>
                   </pic:nvPicPr>
                   <pic:blipFill>
-                    <a:blip r:embed="rId39" cstate="print">
+                    <a:blip r:embed="rId41" cstate="print">
                       <a:extLst>
                         <a:ext uri="{28A0092B-C50C-407E-A947-70E740481C1C}">
                           <a14:useLocalDpi xmlns:a14="http://schemas.microsoft.com/office/drawing/2010/main" val="0"/>
@@ -3194,7 +3196,7 @@
                     </pic:cNvPicPr>
                   </pic:nvPicPr>
                   <pic:blipFill>
-                    <a:blip r:embed="rId40" cstate="print">
+                    <a:blip r:embed="rId42" cstate="print">
                       <a:extLst>
                         <a:ext uri="{28A0092B-C50C-407E-A947-70E740481C1C}">
                           <a14:useLocalDpi xmlns:a14="http://schemas.microsoft.com/office/drawing/2010/main" val="0"/>
@@ -3229,9 +3231,17 @@
           <w:noProof/>
         </w:rPr>
         <w:drawing>
-          <wp:inline distT="0" distB="0" distL="0" distR="0" wp14:anchorId="282425A3" wp14:editId="331AEBA2">
+          <wp:anchor distT="0" distB="0" distL="114300" distR="114300" simplePos="0" relativeHeight="251658240" behindDoc="0" locked="0" layoutInCell="1" allowOverlap="1" wp14:anchorId="282425A3" wp14:editId="200A37F8">
+            <wp:simplePos x="914400" y="4419600"/>
+            <wp:positionH relativeFrom="column">
+              <wp:align>left</wp:align>
+            </wp:positionH>
+            <wp:positionV relativeFrom="paragraph">
+              <wp:align>top</wp:align>
+            </wp:positionV>
             <wp:extent cx="5966272" cy="3133925"/>
             <wp:effectExtent l="0" t="0" r="0" b="0"/>
+            <wp:wrapSquare wrapText="bothSides"/>
             <wp:docPr id="1484669868" name="Picture 18"/>
             <wp:cNvGraphicFramePr>
               <a:graphicFrameLocks xmlns:a="http://schemas.openxmlformats.org/drawingml/2006/main" noChangeAspect="1"/>
@@ -3246,7 +3256,7 @@
                     </pic:cNvPicPr>
                   </pic:nvPicPr>
                   <pic:blipFill>
-                    <a:blip r:embed="rId41" cstate="print">
+                    <a:blip r:embed="rId43" cstate="print">
                       <a:extLst>
                         <a:ext uri="{28A0092B-C50C-407E-A947-70E740481C1C}">
                           <a14:useLocalDpi xmlns:a14="http://schemas.microsoft.com/office/drawing/2010/main" val="0"/>
@@ -3261,7 +3271,7 @@
                   <pic:spPr bwMode="auto">
                     <a:xfrm>
                       <a:off x="0" y="0"/>
-                      <a:ext cx="5987925" cy="3145299"/>
+                      <a:ext cx="5966272" cy="3133925"/>
                     </a:xfrm>
                     <a:prstGeom prst="rect">
                       <a:avLst/>
@@ -3271,8 +3281,11 @@
                 </pic:pic>
               </a:graphicData>
             </a:graphic>
-          </wp:inline>
+          </wp:anchor>
         </w:drawing>
+      </w:r>
+      <w:r>
+        <w:br w:type="textWrapping" w:clear="all"/>
       </w:r>
     </w:p>
     <w:p>
@@ -3328,7 +3341,7 @@
                     </pic:cNvPicPr>
                   </pic:nvPicPr>
                   <pic:blipFill>
-                    <a:blip r:embed="rId42" cstate="print">
+                    <a:blip r:embed="rId44" cstate="print">
                       <a:extLst>
                         <a:ext uri="{28A0092B-C50C-407E-A947-70E740481C1C}">
                           <a14:useLocalDpi xmlns:a14="http://schemas.microsoft.com/office/drawing/2010/main" val="0"/>
@@ -3380,7 +3393,7 @@
                     </pic:cNvPicPr>
                   </pic:nvPicPr>
                   <pic:blipFill>
-                    <a:blip r:embed="rId43" cstate="print">
+                    <a:blip r:embed="rId45" cstate="print">
                       <a:extLst>
                         <a:ext uri="{28A0092B-C50C-407E-A947-70E740481C1C}">
                           <a14:useLocalDpi xmlns:a14="http://schemas.microsoft.com/office/drawing/2010/main" val="0"/>
@@ -3444,7 +3457,7 @@
                     </pic:cNvPicPr>
                   </pic:nvPicPr>
                   <pic:blipFill>
-                    <a:blip r:embed="rId44" cstate="print">
+                    <a:blip r:embed="rId46" cstate="print">
                       <a:extLst>
                         <a:ext uri="{28A0092B-C50C-407E-A947-70E740481C1C}">
                           <a14:useLocalDpi xmlns:a14="http://schemas.microsoft.com/office/drawing/2010/main" val="0"/>
@@ -3496,7 +3509,7 @@
                     </pic:cNvPicPr>
                   </pic:nvPicPr>
                   <pic:blipFill>
-                    <a:blip r:embed="rId45" cstate="print">
+                    <a:blip r:embed="rId47" cstate="print">
                       <a:extLst>
                         <a:ext uri="{28A0092B-C50C-407E-A947-70E740481C1C}">
                           <a14:useLocalDpi xmlns:a14="http://schemas.microsoft.com/office/drawing/2010/main" val="0"/>
@@ -3525,6 +3538,91 @@
         </w:drawing>
       </w:r>
     </w:p>
+    <w:p>
+      <w:r>
+        <w:t xml:space="preserve">duplicated measurements are in </w:t>
+      </w:r>
+      <w:proofErr w:type="gramStart"/>
+      <w:r>
+        <w:t>20210614B1B2summaryreport1.pdf  and</w:t>
+      </w:r>
+      <w:proofErr w:type="gramEnd"/>
+      <w:r>
+        <w:t xml:space="preserve"> in 20210614B1B2peakareasMERGED.pdf ###################################</w:t>
+      </w:r>
+    </w:p>
+    <w:p/>
+    <w:p>
+      <w:r>
+        <w:lastRenderedPageBreak/>
+        <w:t xml:space="preserve">#### The 20210614B1B2peakareasMERGED.pdf GC </w:t>
+      </w:r>
+      <w:r>
+        <w:t>analysis</w:t>
+      </w:r>
+      <w:r>
+        <w:t xml:space="preserve"> was done on 06/30/2021 and the 20210614B1B2peakareasMERGED.pdf on 07/01/2021</w:t>
+      </w:r>
+    </w:p>
+    <w:p>
+      <w:r>
+        <w:t>### Comparing the two data sets 20210614B1B2summaryreport1.pdf and 20210614B1B2peakareasMERGED.pdf #############</w:t>
+      </w:r>
+    </w:p>
+    <w:p>
+      <w:r>
+        <w:t>### The data are identical, one of the data sets can be removed ####</w:t>
+      </w:r>
+    </w:p>
+    <w:p>
+      <w:r>
+        <w:t xml:space="preserve">### </w:t>
+      </w:r>
+      <w:r>
+        <w:t>20210614B1B2peakareasMERGED.pdf</w:t>
+      </w:r>
+      <w:r>
+        <w:t xml:space="preserve"> is removed ###</w:t>
+      </w:r>
+    </w:p>
+    <w:p/>
+    <w:p>
+      <w:r>
+        <w:t xml:space="preserve">20210929B1B2peakareas1 is missing!!!!!!!! </w:t>
+      </w:r>
+      <w:r>
+        <w:t xml:space="preserve">-&gt; has </w:t>
+      </w:r>
+      <w:proofErr w:type="gramStart"/>
+      <w:r>
+        <w:t>an</w:t>
+      </w:r>
+      <w:proofErr w:type="gramEnd"/>
+      <w:r>
+        <w:t xml:space="preserve"> </w:t>
+      </w:r>
+      <w:r>
+        <w:t>GC run problem and has been removed</w:t>
+      </w:r>
+      <w:r>
+        <w:t xml:space="preserve"> </w:t>
+      </w:r>
+    </w:p>
+    <w:p>
+      <w:r>
+        <w:t xml:space="preserve">20210929B1B2peakareas2 is missing!!!!!!!!  </w:t>
+      </w:r>
+      <w:r>
+        <w:t xml:space="preserve">-&gt; was removed by mistake when </w:t>
+      </w:r>
+      <w:r>
+        <w:t>20210929B1B2peakareas1</w:t>
+      </w:r>
+      <w:r>
+        <w:t xml:space="preserve"> was removed. This error has been corrected</w:t>
+      </w:r>
+    </w:p>
+    <w:p/>
     <w:sectPr>
       <w:pgSz w:w="12240" w:h="15840"/>
       <w:pgMar w:top="1440" w:right="1440" w:bottom="1440" w:left="1440" w:header="720" w:footer="720" w:gutter="0"/>
@@ -3533,6 +3631,56 @@
     </w:sectPr>
   </w:body>
 </w:document>
+</file>
+
+<file path=word/endnotes.xml><?xml version="1.0" encoding="utf-8"?>
+<w:endnotes xmlns:wpc="http://schemas.microsoft.com/office/word/2010/wordprocessingCanvas" xmlns:cx="http://schemas.microsoft.com/office/drawing/2014/chartex" xmlns:cx1="http://schemas.microsoft.com/office/drawing/2015/9/8/chartex" xmlns:cx2="http://schemas.microsoft.com/office/drawing/2015/10/21/chartex" xmlns:cx3="http://schemas.microsoft.com/office/drawing/2016/5/9/chartex" xmlns:cx4="http://schemas.microsoft.com/office/drawing/2016/5/10/chartex" xmlns:cx5="http://schemas.microsoft.com/office/drawing/2016/5/11/chartex" xmlns:cx6="http://schemas.microsoft.com/office/drawing/2016/5/12/chartex" xmlns:cx7="http://schemas.microsoft.com/office/drawing/2016/5/13/chartex" xmlns:cx8="http://schemas.microsoft.com/office/drawing/2016/5/14/chartex" xmlns:mc="http://schemas.openxmlformats.org/markup-compatibility/2006" xmlns:aink="http://schemas.microsoft.com/office/drawing/2016/ink" xmlns:am3d="http://schemas.microsoft.com/office/drawing/2017/model3d" xmlns:o="urn:schemas-microsoft-com:office:office" xmlns:oel="http://schemas.microsoft.com/office/2019/extlst" xmlns:r="http://schemas.openxmlformats.org/officeDocument/2006/relationships" xmlns:m="http://schemas.openxmlformats.org/officeDocument/2006/math" xmlns:v="urn:schemas-microsoft-com:vml" xmlns:wp14="http://schemas.microsoft.com/office/word/2010/wordprocessingDrawing" xmlns:wp="http://schemas.openxmlformats.org/drawingml/2006/wordprocessingDrawing" xmlns:w10="urn:schemas-microsoft-com:office:word" xmlns:w="http://schemas.openxmlformats.org/wordprocessingml/2006/main" xmlns:w14="http://schemas.microsoft.com/office/word/2010/wordml" xmlns:w15="http://schemas.microsoft.com/office/word/2012/wordml" xmlns:w16cex="http://schemas.microsoft.com/office/word/2018/wordml/cex" xmlns:w16cid="http://schemas.microsoft.com/office/word/2016/wordml/cid" xmlns:w16="http://schemas.microsoft.com/office/word/2018/wordml" xmlns:w16du="http://schemas.microsoft.com/office/word/2023/wordml/word16du" xmlns:w16sdtdh="http://schemas.microsoft.com/office/word/2020/wordml/sdtdatahash" xmlns:w16sdtfl="http://schemas.microsoft.com/office/word/2024/wordml/sdtformatlock" xmlns:w16se="http://schemas.microsoft.com/office/word/2015/wordml/symex" xmlns:wpg="http://schemas.microsoft.com/office/word/2010/wordprocessingGroup" xmlns:wpi="http://schemas.microsoft.com/office/word/2010/wordprocessingInk" xmlns:wne="http://schemas.microsoft.com/office/word/2006/wordml" xmlns:wps="http://schemas.microsoft.com/office/word/2010/wordprocessingShape" mc:Ignorable="w14 w15 w16se w16cid w16 w16cex w16sdtdh w16sdtfl w16du wp14">
+  <w:endnote w:type="separator" w:id="-1">
+    <w:p>
+      <w:pPr>
+        <w:spacing w:after="0" w:line="240" w:lineRule="auto"/>
+      </w:pPr>
+      <w:r>
+        <w:separator/>
+      </w:r>
+    </w:p>
+  </w:endnote>
+  <w:endnote w:type="continuationSeparator" w:id="0">
+    <w:p>
+      <w:pPr>
+        <w:spacing w:after="0" w:line="240" w:lineRule="auto"/>
+      </w:pPr>
+      <w:r>
+        <w:continuationSeparator/>
+      </w:r>
+    </w:p>
+  </w:endnote>
+</w:endnotes>
+</file>
+
+<file path=word/footnotes.xml><?xml version="1.0" encoding="utf-8"?>
+<w:footnotes xmlns:wpc="http://schemas.microsoft.com/office/word/2010/wordprocessingCanvas" xmlns:cx="http://schemas.microsoft.com/office/drawing/2014/chartex" xmlns:cx1="http://schemas.microsoft.com/office/drawing/2015/9/8/chartex" xmlns:cx2="http://schemas.microsoft.com/office/drawing/2015/10/21/chartex" xmlns:cx3="http://schemas.microsoft.com/office/drawing/2016/5/9/chartex" xmlns:cx4="http://schemas.microsoft.com/office/drawing/2016/5/10/chartex" xmlns:cx5="http://schemas.microsoft.com/office/drawing/2016/5/11/chartex" xmlns:cx6="http://schemas.microsoft.com/office/drawing/2016/5/12/chartex" xmlns:cx7="http://schemas.microsoft.com/office/drawing/2016/5/13/chartex" xmlns:cx8="http://schemas.microsoft.com/office/drawing/2016/5/14/chartex" xmlns:mc="http://schemas.openxmlformats.org/markup-compatibility/2006" xmlns:aink="http://schemas.microsoft.com/office/drawing/2016/ink" xmlns:am3d="http://schemas.microsoft.com/office/drawing/2017/model3d" xmlns:o="urn:schemas-microsoft-com:office:office" xmlns:oel="http://schemas.microsoft.com/office/2019/extlst" xmlns:r="http://schemas.openxmlformats.org/officeDocument/2006/relationships" xmlns:m="http://schemas.openxmlformats.org/officeDocument/2006/math" xmlns:v="urn:schemas-microsoft-com:vml" xmlns:wp14="http://schemas.microsoft.com/office/word/2010/wordprocessingDrawing" xmlns:wp="http://schemas.openxmlformats.org/drawingml/2006/wordprocessingDrawing" xmlns:w10="urn:schemas-microsoft-com:office:word" xmlns:w="http://schemas.openxmlformats.org/wordprocessingml/2006/main" xmlns:w14="http://schemas.microsoft.com/office/word/2010/wordml" xmlns:w15="http://schemas.microsoft.com/office/word/2012/wordml" xmlns:w16cex="http://schemas.microsoft.com/office/word/2018/wordml/cex" xmlns:w16cid="http://schemas.microsoft.com/office/word/2016/wordml/cid" xmlns:w16="http://schemas.microsoft.com/office/word/2018/wordml" xmlns:w16du="http://schemas.microsoft.com/office/word/2023/wordml/word16du" xmlns:w16sdtdh="http://schemas.microsoft.com/office/word/2020/wordml/sdtdatahash" xmlns:w16sdtfl="http://schemas.microsoft.com/office/word/2024/wordml/sdtformatlock" xmlns:w16se="http://schemas.microsoft.com/office/word/2015/wordml/symex" xmlns:wpg="http://schemas.microsoft.com/office/word/2010/wordprocessingGroup" xmlns:wpi="http://schemas.microsoft.com/office/word/2010/wordprocessingInk" xmlns:wne="http://schemas.microsoft.com/office/word/2006/wordml" xmlns:wps="http://schemas.microsoft.com/office/word/2010/wordprocessingShape" mc:Ignorable="w14 w15 w16se w16cid w16 w16cex w16sdtdh w16sdtfl w16du wp14">
+  <w:footnote w:type="separator" w:id="-1">
+    <w:p>
+      <w:pPr>
+        <w:spacing w:after="0" w:line="240" w:lineRule="auto"/>
+      </w:pPr>
+      <w:r>
+        <w:separator/>
+      </w:r>
+    </w:p>
+  </w:footnote>
+  <w:footnote w:type="continuationSeparator" w:id="0">
+    <w:p>
+      <w:pPr>
+        <w:spacing w:after="0" w:line="240" w:lineRule="auto"/>
+      </w:pPr>
+      <w:r>
+        <w:continuationSeparator/>
+      </w:r>
+    </w:p>
+  </w:footnote>
+</w:footnotes>
 </file>
 
 <file path=word/numbering.xml><?xml version="1.0" encoding="utf-8"?>
@@ -4202,6 +4350,50 @@
       <w:szCs w:val="26"/>
     </w:rPr>
   </w:style>
+  <w:style w:type="paragraph" w:styleId="Header">
+    <w:name w:val="header"/>
+    <w:basedOn w:val="Normal"/>
+    <w:link w:val="HeaderChar"/>
+    <w:uiPriority w:val="99"/>
+    <w:unhideWhenUsed/>
+    <w:rsid w:val="00AE68C3"/>
+    <w:pPr>
+      <w:tabs>
+        <w:tab w:val="center" w:pos="4680"/>
+        <w:tab w:val="right" w:pos="9360"/>
+      </w:tabs>
+      <w:spacing w:after="0" w:line="240" w:lineRule="auto"/>
+    </w:pPr>
+  </w:style>
+  <w:style w:type="character" w:customStyle="1" w:styleId="HeaderChar">
+    <w:name w:val="Header Char"/>
+    <w:basedOn w:val="DefaultParagraphFont"/>
+    <w:link w:val="Header"/>
+    <w:uiPriority w:val="99"/>
+    <w:rsid w:val="00AE68C3"/>
+  </w:style>
+  <w:style w:type="paragraph" w:styleId="Footer">
+    <w:name w:val="footer"/>
+    <w:basedOn w:val="Normal"/>
+    <w:link w:val="FooterChar"/>
+    <w:uiPriority w:val="99"/>
+    <w:unhideWhenUsed/>
+    <w:rsid w:val="00AE68C3"/>
+    <w:pPr>
+      <w:tabs>
+        <w:tab w:val="center" w:pos="4680"/>
+        <w:tab w:val="right" w:pos="9360"/>
+      </w:tabs>
+      <w:spacing w:after="0" w:line="240" w:lineRule="auto"/>
+    </w:pPr>
+  </w:style>
+  <w:style w:type="character" w:customStyle="1" w:styleId="FooterChar">
+    <w:name w:val="Footer Char"/>
+    <w:basedOn w:val="DefaultParagraphFont"/>
+    <w:link w:val="Footer"/>
+    <w:uiPriority w:val="99"/>
+    <w:rsid w:val="00AE68C3"/>
+  </w:style>
 </w:styles>
 </file>
 

</xml_diff>

<commit_message>
Worked on the GC calibration equation for CO2
</commit_message>
<xml_diff>
--- a/StrategicTillage_GC_Analysis_workFlow.docx
+++ b/StrategicTillage_GC_Analysis_workFlow.docx
@@ -96,11 +96,9 @@
           <w:numId w:val="1"/>
         </w:numPr>
       </w:pPr>
-      <w:proofErr w:type="spellStart"/>
       <w:r>
         <w:t>StandardCalibration.R</w:t>
       </w:r>
-      <w:proofErr w:type="spellEnd"/>
     </w:p>
     <w:p>
       <w:pPr>
@@ -111,13 +109,7 @@
         </w:numPr>
       </w:pPr>
       <w:r>
-        <w:t>GCAnalysis</w:t>
-      </w:r>
-      <w:r>
-        <w:t>2021</w:t>
-      </w:r>
-      <w:r>
-        <w:t>.R</w:t>
+        <w:t>DataCurationGCAnalysis2021.R</w:t>
       </w:r>
     </w:p>
     <w:p>
@@ -129,10 +121,10 @@
         </w:numPr>
       </w:pPr>
       <w:r>
-        <w:t>GCAnalysis</w:t>
-      </w:r>
-      <w:r>
-        <w:t>2022</w:t>
+        <w:t>DataCurationGCAnalysis202</w:t>
+      </w:r>
+      <w:r>
+        <w:t>2</w:t>
       </w:r>
       <w:r>
         <w:t>.R</w:t>
@@ -146,11 +138,15 @@
           <w:numId w:val="1"/>
         </w:numPr>
       </w:pPr>
-      <w:proofErr w:type="spellStart"/>
-      <w:r>
-        <w:t>HMR_Analysis.R</w:t>
-      </w:r>
-      <w:proofErr w:type="spellEnd"/>
+      <w:r>
+        <w:t>GCAnalysis</w:t>
+      </w:r>
+      <w:r>
+        <w:t>2021</w:t>
+      </w:r>
+      <w:r>
+        <w:t>.R</w:t>
+      </w:r>
     </w:p>
     <w:p>
       <w:pPr>
@@ -161,7 +157,13 @@
         </w:numPr>
       </w:pPr>
       <w:r>
-        <w:t>FelipesHMR2.R</w:t>
+        <w:t>GCAnalysis</w:t>
+      </w:r>
+      <w:r>
+        <w:t>2022</w:t>
+      </w:r>
+      <w:r>
+        <w:t>.R</w:t>
       </w:r>
     </w:p>
     <w:p>
@@ -172,11 +174,9 @@
           <w:numId w:val="1"/>
         </w:numPr>
       </w:pPr>
-      <w:proofErr w:type="spellStart"/>
-      <w:r>
-        <w:t>MassFluxCalculation.R</w:t>
-      </w:r>
-      <w:proofErr w:type="spellEnd"/>
+      <w:r>
+        <w:t>HMR_Analysis.R</w:t>
+      </w:r>
     </w:p>
     <w:p>
       <w:pPr>
@@ -186,11 +186,33 @@
           <w:numId w:val="1"/>
         </w:numPr>
       </w:pPr>
-      <w:proofErr w:type="spellStart"/>
+      <w:r>
+        <w:t>FelipesHMR2.R</w:t>
+      </w:r>
+    </w:p>
+    <w:p>
+      <w:pPr>
+        <w:pStyle w:val="ListParagraph"/>
+        <w:numPr>
+          <w:ilvl w:val="0"/>
+          <w:numId w:val="1"/>
+        </w:numPr>
+      </w:pPr>
+      <w:r>
+        <w:t>MassFluxCalculation.R</w:t>
+      </w:r>
+    </w:p>
+    <w:p>
+      <w:pPr>
+        <w:pStyle w:val="ListParagraph"/>
+        <w:numPr>
+          <w:ilvl w:val="0"/>
+          <w:numId w:val="1"/>
+        </w:numPr>
+      </w:pPr>
       <w:r>
         <w:t>SoilGasFluxStatisticalAnalysis.R</w:t>
       </w:r>
-      <w:proofErr w:type="spellEnd"/>
     </w:p>
     <w:p>
       <w:r>
@@ -215,44 +237,12 @@
     </w:p>
     <w:p>
       <w:r>
-        <w:t xml:space="preserve">The calibration regression for the GC based on standards </w:t>
-      </w:r>
-      <w:proofErr w:type="gramStart"/>
-      <w:r>
-        <w:t>seem</w:t>
-      </w:r>
-      <w:proofErr w:type="gramEnd"/>
-      <w:r>
-        <w:t xml:space="preserve"> to be irrelevant, as the important aspect affecting the emissions is not the </w:t>
-      </w:r>
-      <w:proofErr w:type="gramStart"/>
-      <w:r>
-        <w:t>particular concentration</w:t>
-      </w:r>
-      <w:proofErr w:type="gramEnd"/>
-      <w:r>
-        <w:t xml:space="preserve"> data point, but the slope of the consequent concentration measurement inside the chamber that </w:t>
-      </w:r>
-      <w:proofErr w:type="gramStart"/>
-      <w:r>
-        <w:t>result</w:t>
-      </w:r>
-      <w:proofErr w:type="gramEnd"/>
-      <w:r>
-        <w:t xml:space="preserve"> in the emission rate.</w:t>
-      </w:r>
-    </w:p>
-    <w:p>
-      <w:r>
-        <w:t xml:space="preserve">The data from the GC does not </w:t>
-      </w:r>
-      <w:proofErr w:type="gramStart"/>
-      <w:r>
-        <w:t>seems</w:t>
-      </w:r>
-      <w:proofErr w:type="gramEnd"/>
-      <w:r>
-        <w:t xml:space="preserve"> to indicate any mayor difference in the results. The high emissions do not seem to be the result of the GC analysis.</w:t>
+        <w:t>The calibration regression for the GC based on standards seem to be irrelevant, as the important aspect affecting the emissions is not the particular concentration data point, but the slope of the consequent concentration measurement inside the chamber that result in the emission rate.</w:t>
+      </w:r>
+    </w:p>
+    <w:p>
+      <w:r>
+        <w:t>The data from the GC does not seems to indicate any mayor difference in the results. The high emissions do not seem to be the result of the GC analysis.</w:t>
       </w:r>
     </w:p>
     <w:p>
@@ -273,22 +263,13 @@
     </w:p>
     <w:p>
       <w:r>
-        <w:t xml:space="preserve">Plotting the daily emissions (period emissions) against time </w:t>
-      </w:r>
-      <w:proofErr w:type="gramStart"/>
-      <w:r>
-        <w:t>it is clear that the</w:t>
-      </w:r>
-      <w:proofErr w:type="gramEnd"/>
-      <w:r>
-        <w:t xml:space="preserve"> main factor determining the higher emissions in blocks 1 and 2 are high N2O emission peaks. Those peaks are not present in blocks 3 and 4.</w:t>
+        <w:t>Plotting the daily emissions (period emissions) against time it is clear that the main factor determining the higher emissions in blocks 1 and 2 are high N2O emission peaks. Those peaks are not present in blocks 3 and 4.</w:t>
       </w:r>
     </w:p>
     <w:p>
       <w:r>
         <w:t xml:space="preserve">In 2021, Sampling date </w:t>
       </w:r>
-      <w:proofErr w:type="gramStart"/>
       <w:r>
         <w:t>20210614</w:t>
       </w:r>
@@ -296,42 +277,22 @@
         <w:t xml:space="preserve">, </w:t>
       </w:r>
       <w:r>
-        <w:t xml:space="preserve"> and</w:t>
-      </w:r>
-      <w:proofErr w:type="gramEnd"/>
+        <w:t xml:space="preserve"> and </w:t>
+      </w:r>
+      <w:r>
+        <w:t>20210629</w:t>
+      </w:r>
       <w:r>
         <w:t xml:space="preserve"> </w:t>
       </w:r>
       <w:r>
-        <w:t>20210629</w:t>
+        <w:t>has problems:  The red points in the graph below all belong</w:t>
       </w:r>
       <w:r>
         <w:t xml:space="preserve"> </w:t>
       </w:r>
       <w:r>
-        <w:t>has problems</w:t>
-      </w:r>
-      <w:proofErr w:type="gramStart"/>
-      <w:r>
-        <w:t>:  The</w:t>
-      </w:r>
-      <w:proofErr w:type="gramEnd"/>
-      <w:r>
-        <w:t xml:space="preserve"> red points in the graph below all </w:t>
-      </w:r>
-      <w:proofErr w:type="gramStart"/>
-      <w:r>
-        <w:t>belong</w:t>
-      </w:r>
-      <w:r>
-        <w:t xml:space="preserve"> </w:t>
-      </w:r>
-      <w:r>
-        <w:t xml:space="preserve"> to</w:t>
-      </w:r>
-      <w:proofErr w:type="gramEnd"/>
-      <w:r>
-        <w:t xml:space="preserve"> sampling day </w:t>
+        <w:t xml:space="preserve"> to sampling day </w:t>
       </w:r>
       <w:r>
         <w:t>20210614</w:t>
@@ -345,49 +306,7 @@
         <w:rPr>
           <w:highlight w:val="yellow"/>
         </w:rPr>
-        <w:t xml:space="preserve">The final data for the mass flux calculations was taken from f0 and the missing data from “data error” from </w:t>
-      </w:r>
-      <w:proofErr w:type="gramStart"/>
-      <w:r>
-        <w:rPr>
-          <w:highlight w:val="yellow"/>
-        </w:rPr>
-        <w:t>LR.f</w:t>
-      </w:r>
-      <w:proofErr w:type="gramEnd"/>
-      <w:r>
-        <w:rPr>
-          <w:highlight w:val="yellow"/>
-        </w:rPr>
-        <w:t xml:space="preserve">0. For N2O and CH4 all the data </w:t>
-      </w:r>
-      <w:proofErr w:type="gramStart"/>
-      <w:r>
-        <w:rPr>
-          <w:highlight w:val="yellow"/>
-        </w:rPr>
-        <w:t>has to</w:t>
-      </w:r>
-      <w:proofErr w:type="gramEnd"/>
-      <w:r>
-        <w:rPr>
-          <w:highlight w:val="yellow"/>
-        </w:rPr>
-        <w:t xml:space="preserve"> come from </w:t>
-      </w:r>
-      <w:proofErr w:type="gramStart"/>
-      <w:r>
-        <w:rPr>
-          <w:highlight w:val="yellow"/>
-        </w:rPr>
-        <w:t>LR.f</w:t>
-      </w:r>
-      <w:proofErr w:type="gramEnd"/>
-      <w:r>
-        <w:rPr>
-          <w:highlight w:val="yellow"/>
-        </w:rPr>
-        <w:t>0.</w:t>
+        <w:t>The final data for the mass flux calculations was taken from f0 and the missing data from “data error” from LR.f0. For N2O and CH4 all the data has to come from LR.f0.</w:t>
       </w:r>
     </w:p>
     <w:p>
@@ -510,7 +429,6 @@
         </w:rPr>
         <w:t xml:space="preserve">The Standards Names </w:t>
       </w:r>
-      <w:proofErr w:type="spellStart"/>
       <w:r>
         <w:rPr>
           <w:b/>
@@ -518,59 +436,7 @@
           <w:sz w:val="40"/>
           <w:szCs w:val="40"/>
         </w:rPr>
-        <w:t>PerSTDA</w:t>
-      </w:r>
-      <w:proofErr w:type="spellEnd"/>
-      <w:r>
-        <w:rPr>
-          <w:b/>
-          <w:bCs/>
-          <w:sz w:val="40"/>
-          <w:szCs w:val="40"/>
-        </w:rPr>
-        <w:t xml:space="preserve"> and </w:t>
-      </w:r>
-      <w:proofErr w:type="spellStart"/>
-      <w:r>
-        <w:rPr>
-          <w:b/>
-          <w:bCs/>
-          <w:sz w:val="40"/>
-          <w:szCs w:val="40"/>
-        </w:rPr>
-        <w:t>PerSTD</w:t>
-      </w:r>
-      <w:proofErr w:type="spellEnd"/>
-      <w:r>
-        <w:rPr>
-          <w:b/>
-          <w:bCs/>
-          <w:sz w:val="40"/>
-          <w:szCs w:val="40"/>
-        </w:rPr>
-        <w:t xml:space="preserve"> are not consistent </w:t>
-      </w:r>
-      <w:proofErr w:type="spellStart"/>
-      <w:proofErr w:type="gramStart"/>
-      <w:r>
-        <w:rPr>
-          <w:b/>
-          <w:bCs/>
-          <w:sz w:val="40"/>
-          <w:szCs w:val="40"/>
-        </w:rPr>
-        <w:t>through out</w:t>
-      </w:r>
-      <w:proofErr w:type="spellEnd"/>
-      <w:proofErr w:type="gramEnd"/>
-      <w:r>
-        <w:rPr>
-          <w:b/>
-          <w:bCs/>
-          <w:sz w:val="40"/>
-          <w:szCs w:val="40"/>
-        </w:rPr>
-        <w:t xml:space="preserve"> 2021, therefore </w:t>
+        <w:t xml:space="preserve">PerSTDA and PerSTD are not consistent through out 2021, therefore </w:t>
       </w:r>
       <w:r>
         <w:rPr>
@@ -1560,21 +1426,12 @@
         </w:rPr>
         <w:t xml:space="preserve">Outliers </w:t>
       </w:r>
-      <w:proofErr w:type="gramStart"/>
-      <w:r>
-        <w:rPr>
-          <w:sz w:val="24"/>
-          <w:szCs w:val="24"/>
-        </w:rPr>
-        <w:t>1091 ,</w:t>
-      </w:r>
-      <w:proofErr w:type="gramEnd"/>
-      <w:r>
-        <w:rPr>
-          <w:sz w:val="24"/>
-          <w:szCs w:val="24"/>
-        </w:rPr>
-        <w:t xml:space="preserve"> 1113</w:t>
+      <w:r>
+        <w:rPr>
+          <w:sz w:val="24"/>
+          <w:szCs w:val="24"/>
+        </w:rPr>
+        <w:t>1091 , 1113</w:t>
       </w:r>
     </w:p>
     <w:p>
@@ -1875,21 +1732,8 @@
     </w:p>
     <w:p>
       <w:r>
-        <w:t>2021-07-</w:t>
-      </w:r>
-      <w:proofErr w:type="gramStart"/>
-      <w:r>
-        <w:t>07  Missing</w:t>
-      </w:r>
-      <w:proofErr w:type="gramEnd"/>
-      <w:r>
-        <w:t xml:space="preserve"> </w:t>
-      </w:r>
-      <w:proofErr w:type="gramStart"/>
-      <w:r>
-        <w:t>20210702b3b407b2peakareas.pdf ????</w:t>
-      </w:r>
-      <w:proofErr w:type="gramEnd"/>
+        <w:t>2021-07-07  Missing 20210702b3b407b2peakareas.pdf ????</w:t>
+      </w:r>
     </w:p>
     <w:p>
       <w:r>
@@ -2000,15 +1844,7 @@
         <w:t xml:space="preserve">Records 1424 and 1435 are </w:t>
       </w:r>
       <w:r>
-        <w:t xml:space="preserve">strange. They are </w:t>
-      </w:r>
-      <w:proofErr w:type="gramStart"/>
-      <w:r>
-        <w:t>from</w:t>
-      </w:r>
-      <w:proofErr w:type="gramEnd"/>
-      <w:r>
-        <w:t xml:space="preserve"> a new standard. And are strangely consistent</w:t>
+        <w:t>strange. They are from a new standard. And are strangely consistent</w:t>
       </w:r>
     </w:p>
     <w:p>
@@ -2131,26 +1967,10 @@
         <w:t xml:space="preserve">Records 1510, </w:t>
       </w:r>
       <w:r>
-        <w:t xml:space="preserve">1521, </w:t>
-      </w:r>
-      <w:proofErr w:type="gramStart"/>
-      <w:r>
-        <w:t>1596 ,</w:t>
-      </w:r>
-      <w:proofErr w:type="gramEnd"/>
-      <w:r>
-        <w:t xml:space="preserve"> 1607 </w:t>
-      </w:r>
-      <w:r>
-        <w:t xml:space="preserve">and 1435 are strange. They are </w:t>
-      </w:r>
-      <w:proofErr w:type="gramStart"/>
-      <w:r>
-        <w:t>from</w:t>
-      </w:r>
-      <w:proofErr w:type="gramEnd"/>
-      <w:r>
-        <w:t xml:space="preserve"> a new standard. And are strangely consistent</w:t>
+        <w:t xml:space="preserve">1521, 1596 , 1607 </w:t>
+      </w:r>
+      <w:r>
+        <w:t>and 1435 are strange. They are from a new standard. And are strangely consistent</w:t>
       </w:r>
       <w:r>
         <w:t>.</w:t>
@@ -2273,15 +2093,7 @@
     </w:p>
     <w:p>
       <w:r>
-        <w:t xml:space="preserve">1768 and 1779 </w:t>
-      </w:r>
-      <w:proofErr w:type="gramStart"/>
-      <w:r>
-        <w:t>seemed  switched</w:t>
-      </w:r>
-      <w:proofErr w:type="gramEnd"/>
-      <w:r>
-        <w:t>; 50 is 100 and 100 is 50.</w:t>
+        <w:t>1768 and 1779 seemed  switched; 50 is 100 and 100 is 50.</w:t>
       </w:r>
     </w:p>
     <w:p>
@@ -2414,6 +2226,7 @@
     </w:p>
     <w:p>
       <w:r>
+        <w:lastRenderedPageBreak/>
         <w:t>2021-08-05</w:t>
       </w:r>
     </w:p>
@@ -3008,23 +2821,7 @@
     </w:p>
     <w:p>
       <w:r>
-        <w:t xml:space="preserve">Switch </w:t>
-      </w:r>
-      <w:proofErr w:type="gramStart"/>
-      <w:r>
-        <w:t>records  2810</w:t>
-      </w:r>
-      <w:proofErr w:type="gramEnd"/>
-      <w:r>
-        <w:t xml:space="preserve">, </w:t>
-      </w:r>
-      <w:proofErr w:type="gramStart"/>
-      <w:r>
-        <w:t>2724,  2799</w:t>
-      </w:r>
-      <w:proofErr w:type="gramEnd"/>
-      <w:r>
-        <w:t xml:space="preserve"> and 2713</w:t>
+        <w:t>Switch records  2810, 2724,  2799 and 2713</w:t>
       </w:r>
     </w:p>
     <w:p>
@@ -3231,7 +3028,7 @@
           <w:noProof/>
         </w:rPr>
         <w:drawing>
-          <wp:anchor distT="0" distB="0" distL="114300" distR="114300" simplePos="0" relativeHeight="251658240" behindDoc="0" locked="0" layoutInCell="1" allowOverlap="1" wp14:anchorId="282425A3" wp14:editId="200A37F8">
+          <wp:anchor distT="0" distB="0" distL="114300" distR="114300" simplePos="0" relativeHeight="251658240" behindDoc="0" locked="0" layoutInCell="1" allowOverlap="1" wp14:anchorId="282425A3" wp14:editId="07C40F4C">
             <wp:simplePos x="914400" y="4419600"/>
             <wp:positionH relativeFrom="column">
               <wp:align>left</wp:align>
@@ -3540,28 +3337,14 @@
     </w:p>
     <w:p>
       <w:r>
-        <w:t xml:space="preserve">duplicated measurements are in </w:t>
-      </w:r>
-      <w:proofErr w:type="gramStart"/>
-      <w:r>
-        <w:t>20210614B1B2summaryreport1.pdf  and</w:t>
-      </w:r>
-      <w:proofErr w:type="gramEnd"/>
-      <w:r>
-        <w:t xml:space="preserve"> in 20210614B1B2peakareasMERGED.pdf ###################################</w:t>
+        <w:t>duplicated measurements are in 20210614B1B2summaryreport1.pdf  and in 20210614B1B2peakareasMERGED.pdf ###################################</w:t>
       </w:r>
     </w:p>
     <w:p/>
     <w:p>
       <w:r>
         <w:lastRenderedPageBreak/>
-        <w:t xml:space="preserve">#### The 20210614B1B2peakareasMERGED.pdf GC </w:t>
-      </w:r>
-      <w:r>
-        <w:t>analysis</w:t>
-      </w:r>
-      <w:r>
-        <w:t xml:space="preserve"> was done on 06/30/2021 and the 20210614B1B2peakareasMERGED.pdf on 07/01/2021</w:t>
+        <w:t>#### The 20210614B1B2peakareasMERGED.pdf GC analysis was done on 06/30/2021 and the 20210614B1B2peakareasMERGED.pdf on 07/01/2021</w:t>
       </w:r>
     </w:p>
     <w:p>
@@ -3576,13 +3359,7 @@
     </w:p>
     <w:p>
       <w:r>
-        <w:t xml:space="preserve">### </w:t>
-      </w:r>
-      <w:r>
-        <w:t>20210614B1B2peakareasMERGED.pdf</w:t>
-      </w:r>
-      <w:r>
-        <w:t xml:space="preserve"> is removed ###</w:t>
+        <w:t>### 20210614B1B2peakareasMERGED.pdf is removed ###</w:t>
       </w:r>
     </w:p>
     <w:p/>
@@ -3591,35 +3368,21 @@
         <w:t xml:space="preserve">20210929B1B2peakareas1 is missing!!!!!!!! </w:t>
       </w:r>
       <w:r>
-        <w:t xml:space="preserve">-&gt; has </w:t>
-      </w:r>
-      <w:proofErr w:type="gramStart"/>
-      <w:r>
-        <w:t>an</w:t>
-      </w:r>
-      <w:proofErr w:type="gramEnd"/>
+        <w:t xml:space="preserve">-&gt; has an </w:t>
+      </w:r>
+      <w:r>
+        <w:t>GC run problem and has been removed</w:t>
+      </w:r>
       <w:r>
         <w:t xml:space="preserve"> </w:t>
       </w:r>
-      <w:r>
-        <w:t>GC run problem and has been removed</w:t>
-      </w:r>
-      <w:r>
-        <w:t xml:space="preserve"> </w:t>
-      </w:r>
     </w:p>
     <w:p>
       <w:r>
         <w:t xml:space="preserve">20210929B1B2peakareas2 is missing!!!!!!!!  </w:t>
       </w:r>
       <w:r>
-        <w:t xml:space="preserve">-&gt; was removed by mistake when </w:t>
-      </w:r>
-      <w:r>
-        <w:t>20210929B1B2peakareas1</w:t>
-      </w:r>
-      <w:r>
-        <w:t xml:space="preserve"> was removed. This error has been corrected</w:t>
+        <w:t>-&gt; was removed by mistake when 20210929B1B2peakareas1 was removed. This error has been corrected</w:t>
       </w:r>
     </w:p>
     <w:p/>

</xml_diff>